<commit_message>
chore: checkpoint antes do ajuste de layout dos cards de oficios
</commit_message>
<xml_diff>
--- a/eventos/resources/documentos/modelo_plano_de_trabalho.docx
+++ b/eventos/resources/documentos/modelo_plano_de_trabalho.docx
@@ -135,6 +135,25 @@
           <w:szCs w:val="24"/>
         </w:rPr>
         <w:t>BREVE CONTEXTUALIZAÇÃO</w:t>
+      </w:r>
+    </w:p>
+    <w:p>
+      <w:pPr>
+        <w:keepNext w:val="1"/>
+        <w:keepLines w:val="1"/>
+        <w:pageBreakBefore w:val="0"/>
+        <w:widowControl w:val="0"/>
+        <w:spacing w:before="574" w:line="344" w:lineRule="auto"/>
+        <w:ind w:right="3" w:firstLine="425"/>
+        <w:jc w:val="both"/>
+        <w:rPr>
+          <w:b w:val="1"/>
+          <w:bCs w:val="1"/>
+          <w:color w:val="000009"/>
+        </w:rPr>
+      </w:pPr>
+      <w:r>
+        <w:t xml:space="preserve">Objetivo / finalidade: {{objetivo}}</w:t>
       </w:r>
     </w:p>
     <w:p>

</xml_diff>